<commit_message>
added tasks for laba2
</commit_message>
<xml_diff>
--- a/laba2/Практическая работа №2 Карась Д. А. ИВБ-411 АИТ.docx
+++ b/laba2/Практическая работа №2 Карась Д. А. ИВБ-411 АИТ.docx
@@ -324,7 +324,7 @@
           <w:b/>
           <w:sz w:val="28"/>
           <w:szCs w:val="28"/>
-          <w:lang w:val="en-US" w:eastAsia="ru-RU"/>
+          <w:lang w:eastAsia="ru-RU"/>
         </w:rPr>
       </w:pPr>
       <w:r>
@@ -1912,7 +1912,7 @@
           <w:sz w:val="28"/>
           <w:szCs w:val="28"/>
         </w:rPr>
-        <w:t xml:space="preserve"> Обходы графа (BFS, DFS, DFS-лес). </w:t>
+        <w:t xml:space="preserve"> Обходы графа (BFS, DFS, DFS-лес)</w:t>
       </w:r>
     </w:p>
     <w:p>
@@ -1921,7 +1921,6 @@
           <w:rFonts w:ascii="Times New Roman" w:hAnsi="Times New Roman" w:cs="Times New Roman"/>
           <w:sz w:val="28"/>
           <w:szCs w:val="28"/>
-          <w:lang w:val="en-US"/>
         </w:rPr>
       </w:pPr>
     </w:p>
@@ -1975,7 +1974,7 @@
           <w:sz w:val="28"/>
           <w:szCs w:val="28"/>
         </w:rPr>
-        <w:t>).</w:t>
+        <w:t>)</w:t>
       </w:r>
     </w:p>
     <w:p>
@@ -2059,7 +2058,7 @@
           <w:sz w:val="28"/>
           <w:szCs w:val="28"/>
         </w:rPr>
-        <w:t xml:space="preserve"> и Прим).</w:t>
+        <w:t xml:space="preserve"> и Прим)</w:t>
       </w:r>
     </w:p>
     <w:p>
@@ -3960,6 +3959,7 @@
   <w:style w:type="character" w:default="1" w:styleId="a0">
     <w:name w:val="Default Paragraph Font"/>
     <w:uiPriority w:val="1"/>
+    <w:semiHidden/>
     <w:unhideWhenUsed/>
   </w:style>
   <w:style w:type="table" w:default="1" w:styleId="a1">

</xml_diff>

<commit_message>
solution of part 1
</commit_message>
<xml_diff>
--- a/laba2/Практическая работа №2 Карась Д. А. ИВБ-411 АИТ.docx
+++ b/laba2/Практическая работа №2 Карась Д. А. ИВБ-411 АИТ.docx
@@ -1924,17 +1924,617 @@
         </w:rPr>
       </w:pPr>
     </w:p>
+    <w:tbl>
+      <w:tblPr>
+        <w:tblStyle w:val="ac"/>
+        <w:tblW w:w="0" w:type="auto"/>
+        <w:tblLook w:val="04A0" w:firstRow="1" w:lastRow="0" w:firstColumn="1" w:lastColumn="0" w:noHBand="0" w:noVBand="1"/>
+      </w:tblPr>
+      <w:tblGrid>
+        <w:gridCol w:w="1591"/>
+        <w:gridCol w:w="1456"/>
+        <w:gridCol w:w="1138"/>
+        <w:gridCol w:w="1638"/>
+        <w:gridCol w:w="1645"/>
+        <w:gridCol w:w="1877"/>
+      </w:tblGrid>
+      <w:tr>
+        <w:tc>
+          <w:tcPr>
+            <w:tcW w:w="0" w:type="auto"/>
+            <w:hideMark/>
+          </w:tcPr>
+          <w:p>
+            <w:pPr>
+              <w:rPr>
+                <w:rFonts w:ascii="Times New Roman" w:hAnsi="Times New Roman" w:cs="Times New Roman"/>
+                <w:b/>
+                <w:bCs/>
+                <w:sz w:val="28"/>
+                <w:szCs w:val="24"/>
+              </w:rPr>
+            </w:pPr>
+            <w:r>
+              <w:rPr>
+                <w:rFonts w:ascii="Times New Roman" w:hAnsi="Times New Roman" w:cs="Times New Roman"/>
+                <w:b/>
+                <w:bCs/>
+                <w:sz w:val="28"/>
+                <w:szCs w:val="24"/>
+              </w:rPr>
+              <w:t>Размер графа</w:t>
+            </w:r>
+          </w:p>
+        </w:tc>
+        <w:tc>
+          <w:tcPr>
+            <w:tcW w:w="0" w:type="auto"/>
+            <w:hideMark/>
+          </w:tcPr>
+          <w:p>
+            <w:pPr>
+              <w:rPr>
+                <w:rFonts w:ascii="Times New Roman" w:hAnsi="Times New Roman" w:cs="Times New Roman"/>
+                <w:b/>
+                <w:bCs/>
+                <w:sz w:val="28"/>
+                <w:szCs w:val="24"/>
+              </w:rPr>
+            </w:pPr>
+            <w:r>
+              <w:rPr>
+                <w:rFonts w:ascii="Times New Roman" w:hAnsi="Times New Roman" w:cs="Times New Roman"/>
+                <w:b/>
+                <w:bCs/>
+                <w:sz w:val="28"/>
+                <w:szCs w:val="24"/>
+              </w:rPr>
+              <w:t>Вершин (V)</w:t>
+            </w:r>
+          </w:p>
+        </w:tc>
+        <w:tc>
+          <w:tcPr>
+            <w:tcW w:w="0" w:type="auto"/>
+            <w:hideMark/>
+          </w:tcPr>
+          <w:p>
+            <w:pPr>
+              <w:rPr>
+                <w:rFonts w:ascii="Times New Roman" w:hAnsi="Times New Roman" w:cs="Times New Roman"/>
+                <w:b/>
+                <w:bCs/>
+                <w:sz w:val="28"/>
+                <w:szCs w:val="24"/>
+              </w:rPr>
+            </w:pPr>
+            <w:r>
+              <w:rPr>
+                <w:rFonts w:ascii="Times New Roman" w:hAnsi="Times New Roman" w:cs="Times New Roman"/>
+                <w:b/>
+                <w:bCs/>
+                <w:sz w:val="28"/>
+                <w:szCs w:val="24"/>
+              </w:rPr>
+              <w:t>Рёбер (E)</w:t>
+            </w:r>
+          </w:p>
+        </w:tc>
+        <w:tc>
+          <w:tcPr>
+            <w:tcW w:w="0" w:type="auto"/>
+            <w:hideMark/>
+          </w:tcPr>
+          <w:p>
+            <w:pPr>
+              <w:rPr>
+                <w:rFonts w:ascii="Times New Roman" w:hAnsi="Times New Roman" w:cs="Times New Roman"/>
+                <w:b/>
+                <w:bCs/>
+                <w:sz w:val="28"/>
+                <w:szCs w:val="24"/>
+              </w:rPr>
+            </w:pPr>
+            <w:r>
+              <w:rPr>
+                <w:rFonts w:ascii="Times New Roman" w:hAnsi="Times New Roman" w:cs="Times New Roman"/>
+                <w:b/>
+                <w:bCs/>
+                <w:sz w:val="28"/>
+                <w:szCs w:val="24"/>
+              </w:rPr>
+              <w:t>Время BFS (мкс)</w:t>
+            </w:r>
+          </w:p>
+        </w:tc>
+        <w:tc>
+          <w:tcPr>
+            <w:tcW w:w="0" w:type="auto"/>
+            <w:hideMark/>
+          </w:tcPr>
+          <w:p>
+            <w:pPr>
+              <w:rPr>
+                <w:rFonts w:ascii="Times New Roman" w:hAnsi="Times New Roman" w:cs="Times New Roman"/>
+                <w:b/>
+                <w:bCs/>
+                <w:sz w:val="28"/>
+                <w:szCs w:val="24"/>
+              </w:rPr>
+            </w:pPr>
+            <w:r>
+              <w:rPr>
+                <w:rFonts w:ascii="Times New Roman" w:hAnsi="Times New Roman" w:cs="Times New Roman"/>
+                <w:b/>
+                <w:bCs/>
+                <w:sz w:val="28"/>
+                <w:szCs w:val="24"/>
+              </w:rPr>
+              <w:t>Время DFS (мкс)</w:t>
+            </w:r>
+          </w:p>
+        </w:tc>
+        <w:tc>
+          <w:tcPr>
+            <w:tcW w:w="0" w:type="auto"/>
+            <w:hideMark/>
+          </w:tcPr>
+          <w:p>
+            <w:pPr>
+              <w:rPr>
+                <w:rFonts w:ascii="Times New Roman" w:hAnsi="Times New Roman" w:cs="Times New Roman"/>
+                <w:b/>
+                <w:bCs/>
+                <w:sz w:val="28"/>
+                <w:szCs w:val="24"/>
+              </w:rPr>
+            </w:pPr>
+            <w:r>
+              <w:rPr>
+                <w:rFonts w:ascii="Times New Roman" w:hAnsi="Times New Roman" w:cs="Times New Roman"/>
+                <w:b/>
+                <w:bCs/>
+                <w:sz w:val="28"/>
+                <w:szCs w:val="24"/>
+              </w:rPr>
+              <w:t>Время DFS-лес (мкс)</w:t>
+            </w:r>
+          </w:p>
+        </w:tc>
+      </w:tr>
+      <w:tr>
+        <w:tc>
+          <w:tcPr>
+            <w:tcW w:w="0" w:type="auto"/>
+            <w:hideMark/>
+          </w:tcPr>
+          <w:p>
+            <w:pPr>
+              <w:rPr>
+                <w:rFonts w:ascii="Times New Roman" w:hAnsi="Times New Roman" w:cs="Times New Roman"/>
+                <w:sz w:val="28"/>
+                <w:szCs w:val="24"/>
+              </w:rPr>
+            </w:pPr>
+            <w:r>
+              <w:rPr>
+                <w:rFonts w:ascii="Times New Roman" w:hAnsi="Times New Roman" w:cs="Times New Roman"/>
+                <w:sz w:val="28"/>
+                <w:szCs w:val="24"/>
+              </w:rPr>
+              <w:t>Малый</w:t>
+            </w:r>
+          </w:p>
+        </w:tc>
+        <w:tc>
+          <w:tcPr>
+            <w:tcW w:w="0" w:type="auto"/>
+            <w:hideMark/>
+          </w:tcPr>
+          <w:p>
+            <w:pPr>
+              <w:rPr>
+                <w:rFonts w:ascii="Times New Roman" w:hAnsi="Times New Roman" w:cs="Times New Roman"/>
+                <w:sz w:val="28"/>
+                <w:szCs w:val="24"/>
+              </w:rPr>
+            </w:pPr>
+            <w:r>
+              <w:rPr>
+                <w:rFonts w:ascii="Times New Roman" w:hAnsi="Times New Roman" w:cs="Times New Roman"/>
+                <w:sz w:val="28"/>
+                <w:szCs w:val="24"/>
+              </w:rPr>
+              <w:t>5</w:t>
+            </w:r>
+          </w:p>
+        </w:tc>
+        <w:tc>
+          <w:tcPr>
+            <w:tcW w:w="0" w:type="auto"/>
+            <w:hideMark/>
+          </w:tcPr>
+          <w:p>
+            <w:pPr>
+              <w:rPr>
+                <w:rFonts w:ascii="Times New Roman" w:hAnsi="Times New Roman" w:cs="Times New Roman"/>
+                <w:sz w:val="28"/>
+                <w:szCs w:val="24"/>
+              </w:rPr>
+            </w:pPr>
+            <w:r>
+              <w:rPr>
+                <w:rFonts w:ascii="Times New Roman" w:hAnsi="Times New Roman" w:cs="Times New Roman"/>
+                <w:sz w:val="28"/>
+                <w:szCs w:val="24"/>
+              </w:rPr>
+              <w:t>5</w:t>
+            </w:r>
+          </w:p>
+        </w:tc>
+        <w:tc>
+          <w:tcPr>
+            <w:tcW w:w="0" w:type="auto"/>
+            <w:hideMark/>
+          </w:tcPr>
+          <w:p>
+            <w:pPr>
+              <w:rPr>
+                <w:rFonts w:ascii="Times New Roman" w:hAnsi="Times New Roman" w:cs="Times New Roman"/>
+                <w:sz w:val="28"/>
+                <w:szCs w:val="24"/>
+              </w:rPr>
+            </w:pPr>
+            <w:r>
+              <w:rPr>
+                <w:rFonts w:ascii="Times New Roman" w:hAnsi="Times New Roman" w:cs="Times New Roman"/>
+                <w:sz w:val="28"/>
+                <w:szCs w:val="24"/>
+                <w:lang w:val="en-US"/>
+              </w:rPr>
+              <w:t>45</w:t>
+            </w:r>
+          </w:p>
+        </w:tc>
+        <w:tc>
+          <w:tcPr>
+            <w:tcW w:w="0" w:type="auto"/>
+            <w:hideMark/>
+          </w:tcPr>
+          <w:p>
+            <w:pPr>
+              <w:rPr>
+                <w:rFonts w:ascii="Times New Roman" w:hAnsi="Times New Roman" w:cs="Times New Roman"/>
+                <w:sz w:val="28"/>
+                <w:szCs w:val="24"/>
+              </w:rPr>
+            </w:pPr>
+            <w:r>
+              <w:rPr>
+                <w:rFonts w:ascii="Times New Roman" w:hAnsi="Times New Roman" w:cs="Times New Roman"/>
+                <w:sz w:val="28"/>
+                <w:szCs w:val="24"/>
+              </w:rPr>
+              <w:t>30</w:t>
+            </w:r>
+          </w:p>
+        </w:tc>
+        <w:tc>
+          <w:tcPr>
+            <w:tcW w:w="0" w:type="auto"/>
+            <w:hideMark/>
+          </w:tcPr>
+          <w:p>
+            <w:pPr>
+              <w:rPr>
+                <w:rFonts w:ascii="Times New Roman" w:hAnsi="Times New Roman" w:cs="Times New Roman"/>
+                <w:sz w:val="28"/>
+                <w:szCs w:val="24"/>
+              </w:rPr>
+            </w:pPr>
+            <w:r>
+              <w:rPr>
+                <w:rFonts w:ascii="Times New Roman" w:hAnsi="Times New Roman" w:cs="Times New Roman"/>
+                <w:sz w:val="28"/>
+                <w:szCs w:val="24"/>
+              </w:rPr>
+              <w:t>596</w:t>
+            </w:r>
+          </w:p>
+        </w:tc>
+      </w:tr>
+      <w:tr>
+        <w:tc>
+          <w:tcPr>
+            <w:tcW w:w="0" w:type="auto"/>
+            <w:hideMark/>
+          </w:tcPr>
+          <w:p>
+            <w:pPr>
+              <w:rPr>
+                <w:rFonts w:ascii="Times New Roman" w:hAnsi="Times New Roman" w:cs="Times New Roman"/>
+                <w:sz w:val="28"/>
+                <w:szCs w:val="24"/>
+              </w:rPr>
+            </w:pPr>
+            <w:r>
+              <w:rPr>
+                <w:rFonts w:ascii="Times New Roman" w:hAnsi="Times New Roman" w:cs="Times New Roman"/>
+                <w:sz w:val="28"/>
+                <w:szCs w:val="24"/>
+              </w:rPr>
+              <w:t>Средний</w:t>
+            </w:r>
+          </w:p>
+        </w:tc>
+        <w:tc>
+          <w:tcPr>
+            <w:tcW w:w="0" w:type="auto"/>
+            <w:hideMark/>
+          </w:tcPr>
+          <w:p>
+            <w:pPr>
+              <w:rPr>
+                <w:rFonts w:ascii="Times New Roman" w:hAnsi="Times New Roman" w:cs="Times New Roman"/>
+                <w:sz w:val="28"/>
+                <w:szCs w:val="24"/>
+              </w:rPr>
+            </w:pPr>
+            <w:r>
+              <w:rPr>
+                <w:rFonts w:ascii="Times New Roman" w:hAnsi="Times New Roman" w:cs="Times New Roman"/>
+                <w:sz w:val="28"/>
+                <w:szCs w:val="24"/>
+              </w:rPr>
+              <w:t>10</w:t>
+            </w:r>
+          </w:p>
+        </w:tc>
+        <w:tc>
+          <w:tcPr>
+            <w:tcW w:w="0" w:type="auto"/>
+            <w:hideMark/>
+          </w:tcPr>
+          <w:p>
+            <w:pPr>
+              <w:rPr>
+                <w:rFonts w:ascii="Times New Roman" w:hAnsi="Times New Roman" w:cs="Times New Roman"/>
+                <w:sz w:val="28"/>
+                <w:szCs w:val="24"/>
+              </w:rPr>
+            </w:pPr>
+            <w:r>
+              <w:rPr>
+                <w:rFonts w:ascii="Times New Roman" w:hAnsi="Times New Roman" w:cs="Times New Roman"/>
+                <w:sz w:val="28"/>
+                <w:szCs w:val="24"/>
+              </w:rPr>
+              <w:t>11</w:t>
+            </w:r>
+          </w:p>
+        </w:tc>
+        <w:tc>
+          <w:tcPr>
+            <w:tcW w:w="0" w:type="auto"/>
+            <w:hideMark/>
+          </w:tcPr>
+          <w:p>
+            <w:pPr>
+              <w:rPr>
+                <w:rFonts w:ascii="Times New Roman" w:hAnsi="Times New Roman" w:cs="Times New Roman"/>
+                <w:sz w:val="28"/>
+                <w:szCs w:val="24"/>
+              </w:rPr>
+            </w:pPr>
+            <w:r>
+              <w:rPr>
+                <w:rFonts w:ascii="Times New Roman" w:hAnsi="Times New Roman" w:cs="Times New Roman"/>
+                <w:sz w:val="28"/>
+                <w:szCs w:val="24"/>
+              </w:rPr>
+              <w:t>61</w:t>
+            </w:r>
+          </w:p>
+        </w:tc>
+        <w:tc>
+          <w:tcPr>
+            <w:tcW w:w="0" w:type="auto"/>
+            <w:hideMark/>
+          </w:tcPr>
+          <w:p>
+            <w:pPr>
+              <w:rPr>
+                <w:rFonts w:ascii="Times New Roman" w:hAnsi="Times New Roman" w:cs="Times New Roman"/>
+                <w:sz w:val="28"/>
+                <w:szCs w:val="24"/>
+              </w:rPr>
+            </w:pPr>
+            <w:r>
+              <w:rPr>
+                <w:rFonts w:ascii="Times New Roman" w:hAnsi="Times New Roman" w:cs="Times New Roman"/>
+                <w:sz w:val="28"/>
+                <w:szCs w:val="24"/>
+              </w:rPr>
+              <w:t>40</w:t>
+            </w:r>
+          </w:p>
+        </w:tc>
+        <w:tc>
+          <w:tcPr>
+            <w:tcW w:w="0" w:type="auto"/>
+            <w:hideMark/>
+          </w:tcPr>
+          <w:p>
+            <w:pPr>
+              <w:rPr>
+                <w:rFonts w:ascii="Times New Roman" w:hAnsi="Times New Roman" w:cs="Times New Roman"/>
+                <w:sz w:val="28"/>
+                <w:szCs w:val="24"/>
+              </w:rPr>
+            </w:pPr>
+            <w:r>
+              <w:rPr>
+                <w:rFonts w:ascii="Times New Roman" w:hAnsi="Times New Roman" w:cs="Times New Roman"/>
+                <w:sz w:val="28"/>
+                <w:szCs w:val="24"/>
+              </w:rPr>
+              <w:t>630</w:t>
+            </w:r>
+          </w:p>
+        </w:tc>
+      </w:tr>
+      <w:tr>
+        <w:tc>
+          <w:tcPr>
+            <w:tcW w:w="0" w:type="auto"/>
+            <w:hideMark/>
+          </w:tcPr>
+          <w:p>
+            <w:pPr>
+              <w:rPr>
+                <w:rFonts w:ascii="Times New Roman" w:hAnsi="Times New Roman" w:cs="Times New Roman"/>
+                <w:sz w:val="28"/>
+                <w:szCs w:val="24"/>
+              </w:rPr>
+            </w:pPr>
+            <w:r>
+              <w:rPr>
+                <w:rFonts w:ascii="Times New Roman" w:hAnsi="Times New Roman" w:cs="Times New Roman"/>
+                <w:sz w:val="28"/>
+                <w:szCs w:val="24"/>
+              </w:rPr>
+              <w:t>Большой</w:t>
+            </w:r>
+          </w:p>
+        </w:tc>
+        <w:tc>
+          <w:tcPr>
+            <w:tcW w:w="0" w:type="auto"/>
+            <w:hideMark/>
+          </w:tcPr>
+          <w:p>
+            <w:pPr>
+              <w:rPr>
+                <w:rFonts w:ascii="Times New Roman" w:hAnsi="Times New Roman" w:cs="Times New Roman"/>
+                <w:sz w:val="28"/>
+                <w:szCs w:val="24"/>
+              </w:rPr>
+            </w:pPr>
+            <w:r>
+              <w:rPr>
+                <w:rFonts w:ascii="Times New Roman" w:hAnsi="Times New Roman" w:cs="Times New Roman"/>
+                <w:sz w:val="28"/>
+                <w:szCs w:val="24"/>
+              </w:rPr>
+              <w:t>20</w:t>
+            </w:r>
+          </w:p>
+        </w:tc>
+        <w:tc>
+          <w:tcPr>
+            <w:tcW w:w="0" w:type="auto"/>
+            <w:hideMark/>
+          </w:tcPr>
+          <w:p>
+            <w:pPr>
+              <w:rPr>
+                <w:rFonts w:ascii="Times New Roman" w:hAnsi="Times New Roman" w:cs="Times New Roman"/>
+                <w:sz w:val="28"/>
+                <w:szCs w:val="24"/>
+              </w:rPr>
+            </w:pPr>
+            <w:r>
+              <w:rPr>
+                <w:rFonts w:ascii="Times New Roman" w:hAnsi="Times New Roman" w:cs="Times New Roman"/>
+                <w:sz w:val="28"/>
+                <w:szCs w:val="24"/>
+              </w:rPr>
+              <w:t>28</w:t>
+            </w:r>
+          </w:p>
+        </w:tc>
+        <w:tc>
+          <w:tcPr>
+            <w:tcW w:w="0" w:type="auto"/>
+            <w:hideMark/>
+          </w:tcPr>
+          <w:p>
+            <w:pPr>
+              <w:rPr>
+                <w:rFonts w:ascii="Times New Roman" w:hAnsi="Times New Roman" w:cs="Times New Roman"/>
+                <w:sz w:val="28"/>
+                <w:szCs w:val="24"/>
+              </w:rPr>
+            </w:pPr>
+            <w:r>
+              <w:rPr>
+                <w:rFonts w:ascii="Times New Roman" w:hAnsi="Times New Roman" w:cs="Times New Roman"/>
+                <w:sz w:val="28"/>
+                <w:szCs w:val="24"/>
+              </w:rPr>
+              <w:t>83</w:t>
+            </w:r>
+          </w:p>
+        </w:tc>
+        <w:tc>
+          <w:tcPr>
+            <w:tcW w:w="0" w:type="auto"/>
+            <w:hideMark/>
+          </w:tcPr>
+          <w:p>
+            <w:pPr>
+              <w:rPr>
+                <w:rFonts w:ascii="Times New Roman" w:hAnsi="Times New Roman" w:cs="Times New Roman"/>
+                <w:sz w:val="28"/>
+                <w:szCs w:val="24"/>
+              </w:rPr>
+            </w:pPr>
+            <w:r>
+              <w:rPr>
+                <w:rFonts w:ascii="Times New Roman" w:hAnsi="Times New Roman" w:cs="Times New Roman"/>
+                <w:sz w:val="28"/>
+                <w:szCs w:val="24"/>
+              </w:rPr>
+              <w:t>59</w:t>
+            </w:r>
+          </w:p>
+        </w:tc>
+        <w:tc>
+          <w:tcPr>
+            <w:tcW w:w="0" w:type="auto"/>
+            <w:hideMark/>
+          </w:tcPr>
+          <w:p>
+            <w:pPr>
+              <w:rPr>
+                <w:rFonts w:ascii="Times New Roman" w:hAnsi="Times New Roman" w:cs="Times New Roman"/>
+                <w:sz w:val="28"/>
+                <w:szCs w:val="24"/>
+              </w:rPr>
+            </w:pPr>
+            <w:r>
+              <w:rPr>
+                <w:rFonts w:ascii="Times New Roman" w:hAnsi="Times New Roman" w:cs="Times New Roman"/>
+                <w:sz w:val="28"/>
+                <w:szCs w:val="24"/>
+              </w:rPr>
+              <w:t>665</w:t>
+            </w:r>
+          </w:p>
+        </w:tc>
+      </w:tr>
+    </w:tbl>
     <w:p>
       <w:pPr>
         <w:rPr>
           <w:rFonts w:ascii="Times New Roman" w:hAnsi="Times New Roman" w:cs="Times New Roman"/>
-          <w:b/>
-          <w:bCs/>
-          <w:sz w:val="28"/>
-          <w:szCs w:val="28"/>
-        </w:rPr>
-      </w:pPr>
-      <w:r>
+          <w:sz w:val="28"/>
+          <w:szCs w:val="24"/>
+        </w:rPr>
+      </w:pPr>
+    </w:p>
+    <w:p>
+      <w:pPr>
         <w:rPr>
           <w:rFonts w:ascii="Times New Roman" w:hAnsi="Times New Roman" w:cs="Times New Roman"/>
           <w:b/>
@@ -1942,6 +2542,259 @@
           <w:sz w:val="28"/>
           <w:szCs w:val="28"/>
         </w:rPr>
+      </w:pPr>
+      <w:r>
+        <w:rPr>
+          <w:rFonts w:ascii="Times New Roman" w:hAnsi="Times New Roman" w:cs="Times New Roman"/>
+          <w:b/>
+          <w:bCs/>
+          <w:sz w:val="28"/>
+          <w:szCs w:val="28"/>
+        </w:rPr>
+        <w:lastRenderedPageBreak/>
+        <w:t>Результаты работы алгоритмов:</w:t>
+      </w:r>
+    </w:p>
+    <w:p>
+      <w:pPr>
+        <w:rPr>
+          <w:rFonts w:ascii="Times New Roman" w:hAnsi="Times New Roman" w:cs="Times New Roman"/>
+          <w:b/>
+          <w:bCs/>
+          <w:sz w:val="28"/>
+          <w:szCs w:val="28"/>
+          <w:lang w:val="en-US"/>
+        </w:rPr>
+      </w:pPr>
+      <w:r>
+        <w:rPr>
+          <w:rFonts w:ascii="Times New Roman" w:hAnsi="Times New Roman" w:cs="Times New Roman"/>
+          <w:b/>
+          <w:bCs/>
+          <w:sz w:val="28"/>
+          <w:szCs w:val="28"/>
+          <w:lang w:val="en-US"/>
+        </w:rPr>
+        <w:drawing>
+          <wp:inline distT="0" distB="0" distL="0" distR="0" wp14:anchorId="399473FC" wp14:editId="001FA389">
+            <wp:extent cx="2928366" cy="2905125"/>
+            <wp:effectExtent l="0" t="0" r="5715" b="0"/>
+            <wp:docPr id="2" name="Рисунок 2"/>
+            <wp:cNvGraphicFramePr>
+              <a:graphicFrameLocks xmlns:a="http://schemas.openxmlformats.org/drawingml/2006/main" noChangeAspect="1"/>
+            </wp:cNvGraphicFramePr>
+            <a:graphic xmlns:a="http://schemas.openxmlformats.org/drawingml/2006/main">
+              <a:graphicData uri="http://schemas.openxmlformats.org/drawingml/2006/picture">
+                <pic:pic xmlns:pic="http://schemas.openxmlformats.org/drawingml/2006/picture">
+                  <pic:nvPicPr>
+                    <pic:cNvPr id="1" name=""/>
+                    <pic:cNvPicPr/>
+                  </pic:nvPicPr>
+                  <pic:blipFill>
+                    <a:blip r:embed="rId5"/>
+                    <a:stretch>
+                      <a:fillRect/>
+                    </a:stretch>
+                  </pic:blipFill>
+                  <pic:spPr>
+                    <a:xfrm>
+                      <a:off x="0" y="0"/>
+                      <a:ext cx="2936112" cy="2912810"/>
+                    </a:xfrm>
+                    <a:prstGeom prst="rect">
+                      <a:avLst/>
+                    </a:prstGeom>
+                  </pic:spPr>
+                </pic:pic>
+              </a:graphicData>
+            </a:graphic>
+          </wp:inline>
+        </w:drawing>
+      </w:r>
+      <w:r>
+        <w:rPr>
+          <w:rFonts w:ascii="Times New Roman" w:hAnsi="Times New Roman" w:cs="Times New Roman"/>
+          <w:b/>
+          <w:bCs/>
+          <w:sz w:val="28"/>
+          <w:szCs w:val="28"/>
+          <w:lang w:val="en-US"/>
+        </w:rPr>
+        <w:drawing>
+          <wp:inline distT="0" distB="0" distL="0" distR="0" wp14:anchorId="6CD3100C" wp14:editId="5601C8A9">
+            <wp:extent cx="2882900" cy="2889684"/>
+            <wp:effectExtent l="0" t="0" r="0" b="6350"/>
+            <wp:docPr id="3" name="Рисунок 3"/>
+            <wp:cNvGraphicFramePr>
+              <a:graphicFrameLocks xmlns:a="http://schemas.openxmlformats.org/drawingml/2006/main" noChangeAspect="1"/>
+            </wp:cNvGraphicFramePr>
+            <a:graphic xmlns:a="http://schemas.openxmlformats.org/drawingml/2006/main">
+              <a:graphicData uri="http://schemas.openxmlformats.org/drawingml/2006/picture">
+                <pic:pic xmlns:pic="http://schemas.openxmlformats.org/drawingml/2006/picture">
+                  <pic:nvPicPr>
+                    <pic:cNvPr id="1" name=""/>
+                    <pic:cNvPicPr/>
+                  </pic:nvPicPr>
+                  <pic:blipFill>
+                    <a:blip r:embed="rId6"/>
+                    <a:stretch>
+                      <a:fillRect/>
+                    </a:stretch>
+                  </pic:blipFill>
+                  <pic:spPr>
+                    <a:xfrm>
+                      <a:off x="0" y="0"/>
+                      <a:ext cx="2908931" cy="2915776"/>
+                    </a:xfrm>
+                    <a:prstGeom prst="rect">
+                      <a:avLst/>
+                    </a:prstGeom>
+                  </pic:spPr>
+                </pic:pic>
+              </a:graphicData>
+            </a:graphic>
+          </wp:inline>
+        </w:drawing>
+      </w:r>
+      <w:r>
+        <w:rPr>
+          <w:noProof/>
+          <w14:ligatures w14:val="standardContextual"/>
+        </w:rPr>
+        <w:t xml:space="preserve"> </w:t>
+      </w:r>
+      <w:r>
+        <w:rPr>
+          <w:noProof/>
+          <w14:ligatures w14:val="standardContextual"/>
+        </w:rPr>
+        <w:drawing>
+          <wp:inline distT="0" distB="0" distL="0" distR="0" wp14:anchorId="5C6AC605" wp14:editId="073B887C">
+            <wp:extent cx="2257740" cy="1228896"/>
+            <wp:effectExtent l="0" t="0" r="9525" b="9525"/>
+            <wp:docPr id="4" name="Рисунок 4"/>
+            <wp:cNvGraphicFramePr>
+              <a:graphicFrameLocks xmlns:a="http://schemas.openxmlformats.org/drawingml/2006/main" noChangeAspect="1"/>
+            </wp:cNvGraphicFramePr>
+            <a:graphic xmlns:a="http://schemas.openxmlformats.org/drawingml/2006/main">
+              <a:graphicData uri="http://schemas.openxmlformats.org/drawingml/2006/picture">
+                <pic:pic xmlns:pic="http://schemas.openxmlformats.org/drawingml/2006/picture">
+                  <pic:nvPicPr>
+                    <pic:cNvPr id="1" name=""/>
+                    <pic:cNvPicPr/>
+                  </pic:nvPicPr>
+                  <pic:blipFill>
+                    <a:blip r:embed="rId7"/>
+                    <a:stretch>
+                      <a:fillRect/>
+                    </a:stretch>
+                  </pic:blipFill>
+                  <pic:spPr>
+                    <a:xfrm>
+                      <a:off x="0" y="0"/>
+                      <a:ext cx="2257740" cy="1228896"/>
+                    </a:xfrm>
+                    <a:prstGeom prst="rect">
+                      <a:avLst/>
+                    </a:prstGeom>
+                  </pic:spPr>
+                </pic:pic>
+              </a:graphicData>
+            </a:graphic>
+          </wp:inline>
+        </w:drawing>
+      </w:r>
+    </w:p>
+    <w:p>
+      <w:pPr>
+        <w:rPr>
+          <w:rFonts w:ascii="Times New Roman" w:hAnsi="Times New Roman" w:cs="Times New Roman"/>
+          <w:b/>
+          <w:bCs/>
+          <w:sz w:val="28"/>
+          <w:szCs w:val="28"/>
+        </w:rPr>
+      </w:pPr>
+      <w:r>
+        <w:rPr>
+          <w:rFonts w:ascii="Times New Roman" w:hAnsi="Times New Roman" w:cs="Times New Roman"/>
+          <w:b/>
+          <w:bCs/>
+          <w:sz w:val="28"/>
+          <w:szCs w:val="28"/>
+        </w:rPr>
+        <w:t>Сравнение алгоритмов:</w:t>
+      </w:r>
+    </w:p>
+    <w:p>
+      <w:pPr>
+        <w:rPr>
+          <w:rFonts w:ascii="Times New Roman" w:hAnsi="Times New Roman" w:cs="Times New Roman"/>
+          <w:sz w:val="28"/>
+          <w:szCs w:val="24"/>
+        </w:rPr>
+      </w:pPr>
+      <w:r>
+        <w:rPr>
+          <w:rFonts w:ascii="Times New Roman" w:hAnsi="Times New Roman" w:cs="Times New Roman"/>
+          <w:sz w:val="28"/>
+          <w:szCs w:val="24"/>
+        </w:rPr>
+        <w:drawing>
+          <wp:inline distT="0" distB="0" distL="0" distR="0" wp14:anchorId="163FD593" wp14:editId="60E70B08">
+            <wp:extent cx="5940425" cy="3565525"/>
+            <wp:effectExtent l="0" t="0" r="3175" b="0"/>
+            <wp:docPr id="1" name="Рисунок 1"/>
+            <wp:cNvGraphicFramePr>
+              <a:graphicFrameLocks xmlns:a="http://schemas.openxmlformats.org/drawingml/2006/main" noChangeAspect="1"/>
+            </wp:cNvGraphicFramePr>
+            <a:graphic xmlns:a="http://schemas.openxmlformats.org/drawingml/2006/main">
+              <a:graphicData uri="http://schemas.openxmlformats.org/drawingml/2006/picture">
+                <pic:pic xmlns:pic="http://schemas.openxmlformats.org/drawingml/2006/picture">
+                  <pic:nvPicPr>
+                    <pic:cNvPr id="1" name=""/>
+                    <pic:cNvPicPr/>
+                  </pic:nvPicPr>
+                  <pic:blipFill>
+                    <a:blip r:embed="rId8"/>
+                    <a:stretch>
+                      <a:fillRect/>
+                    </a:stretch>
+                  </pic:blipFill>
+                  <pic:spPr>
+                    <a:xfrm>
+                      <a:off x="0" y="0"/>
+                      <a:ext cx="5940425" cy="3565525"/>
+                    </a:xfrm>
+                    <a:prstGeom prst="rect">
+                      <a:avLst/>
+                    </a:prstGeom>
+                  </pic:spPr>
+                </pic:pic>
+              </a:graphicData>
+            </a:graphic>
+          </wp:inline>
+        </w:drawing>
+      </w:r>
+    </w:p>
+    <w:p>
+      <w:pPr>
+        <w:rPr>
+          <w:rFonts w:ascii="Times New Roman" w:hAnsi="Times New Roman" w:cs="Times New Roman"/>
+          <w:b/>
+          <w:bCs/>
+          <w:sz w:val="28"/>
+          <w:szCs w:val="28"/>
+        </w:rPr>
+      </w:pPr>
+      <w:r>
+        <w:rPr>
+          <w:rFonts w:ascii="Times New Roman" w:hAnsi="Times New Roman" w:cs="Times New Roman"/>
+          <w:b/>
+          <w:bCs/>
+          <w:sz w:val="28"/>
+          <w:szCs w:val="28"/>
+        </w:rPr>
         <w:t xml:space="preserve">Часть </w:t>
       </w:r>
       <w:r>
@@ -2128,7 +2981,6 @@
           <w:sz w:val="28"/>
           <w:szCs w:val="28"/>
         </w:rPr>
-        <w:lastRenderedPageBreak/>
         <w:t>Результаты работы алгоритмов:</w:t>
       </w:r>
     </w:p>
@@ -3722,7 +4574,7 @@
   <w:style w:type="paragraph" w:default="1" w:styleId="a">
     <w:name w:val="Normal"/>
     <w:qFormat/>
-    <w:rsid w:val="00956E96"/>
+    <w:rsid w:val="005C3BC2"/>
     <w:pPr>
       <w:spacing w:after="200" w:line="276" w:lineRule="auto"/>
     </w:pPr>
@@ -3959,7 +4811,6 @@
   <w:style w:type="character" w:default="1" w:styleId="a0">
     <w:name w:val="Default Paragraph Font"/>
     <w:uiPriority w:val="1"/>
-    <w:semiHidden/>
     <w:unhideWhenUsed/>
   </w:style>
   <w:style w:type="table" w:default="1" w:styleId="a1">
@@ -4307,6 +5158,25 @@
       <w:lang w:eastAsia="ru-RU"/>
     </w:rPr>
   </w:style>
+  <w:style w:type="table" w:styleId="ac">
+    <w:name w:val="Grid Table Light"/>
+    <w:basedOn w:val="a1"/>
+    <w:uiPriority w:val="40"/>
+    <w:rsid w:val="00FE31E6"/>
+    <w:pPr>
+      <w:spacing w:after="0" w:line="240" w:lineRule="auto"/>
+    </w:pPr>
+    <w:tblPr>
+      <w:tblBorders>
+        <w:top w:val="single" w:sz="4" w:space="0" w:color="BFBFBF" w:themeColor="background1" w:themeShade="BF"/>
+        <w:left w:val="single" w:sz="4" w:space="0" w:color="BFBFBF" w:themeColor="background1" w:themeShade="BF"/>
+        <w:bottom w:val="single" w:sz="4" w:space="0" w:color="BFBFBF" w:themeColor="background1" w:themeShade="BF"/>
+        <w:right w:val="single" w:sz="4" w:space="0" w:color="BFBFBF" w:themeColor="background1" w:themeShade="BF"/>
+        <w:insideH w:val="single" w:sz="4" w:space="0" w:color="BFBFBF" w:themeColor="background1" w:themeShade="BF"/>
+        <w:insideV w:val="single" w:sz="4" w:space="0" w:color="BFBFBF" w:themeColor="background1" w:themeShade="BF"/>
+      </w:tblBorders>
+    </w:tblPr>
+  </w:style>
 </w:styles>
 </file>
 

</xml_diff>